<commit_message>
retira porta logica useless
</commit_message>
<xml_diff>
--- a/relatorio_RCD_1F_Grupo9 (2).docx
+++ b/relatorio_RCD_1F_Grupo9 (2).docx
@@ -83,7 +83,7 @@
     <w:p>
       <w:pPr>
         <w:spacing w:before="1800"/>
-        <w:jc w:val="both"/>
+        <w:jc w:val="center"/>
       </w:pPr>
       <w:r>
         <w:rPr>
@@ -99,13 +99,13 @@
     <w:p>
       <w:pPr>
         <w:spacing w:before="60" w:after="600"/>
-        <w:jc w:val="both"/>
+        <w:jc w:val="center"/>
       </w:pPr>
       <w:r>
         <w:rPr>
           <w:color w:val="444444"/>
         </w:rPr>
-        <w:t xml:space="preserve">Redes e Comunicação de Dados </w:t>
+        <w:t>Redes e Comunicação de Dados</w:t>
       </w:r>
     </w:p>
     <w:p>
@@ -119,7 +119,7 @@
     <w:p>
       <w:pPr>
         <w:spacing w:before="600" w:after="100"/>
-        <w:jc w:val="both"/>
+        <w:jc w:val="center"/>
       </w:pPr>
       <w:r>
         <w:rPr>
@@ -135,7 +135,7 @@
     <w:p>
       <w:pPr>
         <w:spacing w:after="600"/>
-        <w:jc w:val="both"/>
+        <w:jc w:val="center"/>
       </w:pPr>
       <w:r>
         <w:rPr>
@@ -280,6 +280,18 @@
         <w:lastRenderedPageBreak/>
         <w:t>Resumo</w:t>
       </w:r>
+    </w:p>
+    <w:p>
+      <w:pPr>
+        <w:pStyle w:val="Ttulo1"/>
+        <w:jc w:val="both"/>
+      </w:pPr>
+    </w:p>
+    <w:p>
+      <w:pPr>
+        <w:pStyle w:val="Ttulo1"/>
+        <w:jc w:val="both"/>
+      </w:pPr>
     </w:p>
     <w:p>
       <w:pPr>
@@ -418,7 +430,21 @@
             <w:rStyle w:val="Hiperligao"/>
             <w:color w:val="000000" w:themeColor="text1"/>
           </w:rPr>
-          <w:t>Introdução</w:t>
+          <w:t>Intro</w:t>
+        </w:r>
+        <w:r>
+          <w:rPr>
+            <w:rStyle w:val="Hiperligao"/>
+            <w:color w:val="000000" w:themeColor="text1"/>
+          </w:rPr>
+          <w:t>d</w:t>
+        </w:r>
+        <w:r>
+          <w:rPr>
+            <w:rStyle w:val="Hiperligao"/>
+            <w:color w:val="000000" w:themeColor="text1"/>
+          </w:rPr>
+          <w:t>ução</w:t>
         </w:r>
       </w:hyperlink>
     </w:p>
@@ -912,7 +938,15 @@
             <w:bCs/>
             <w:color w:val="000000" w:themeColor="text1"/>
           </w:rPr>
-          <w:t xml:space="preserve">NAT </w:t>
+          <w:t>NAT</w:t>
+        </w:r>
+        <w:r>
+          <w:rPr>
+            <w:rStyle w:val="Hiperligao"/>
+            <w:bCs/>
+            <w:color w:val="000000" w:themeColor="text1"/>
+          </w:rPr>
+          <w:t xml:space="preserve"> </w:t>
         </w:r>
         <w:proofErr w:type="spellStart"/>
         <w:r>
@@ -1144,7 +1178,7 @@
           <w:noProof/>
         </w:rPr>
         <w:drawing>
-          <wp:anchor distT="0" distB="0" distL="114300" distR="114300" simplePos="0" relativeHeight="251659264" behindDoc="1" locked="0" layoutInCell="1" allowOverlap="1" wp14:anchorId="67E89F69" wp14:editId="3AF80170">
+          <wp:anchor distT="0" distB="0" distL="114300" distR="114300" simplePos="0" relativeHeight="251659264" behindDoc="1" locked="0" layoutInCell="1" allowOverlap="1" wp14:anchorId="67E89F69" wp14:editId="711E57BC">
             <wp:simplePos x="0" y="0"/>
             <wp:positionH relativeFrom="margin">
               <wp:align>center</wp:align>
@@ -13178,25 +13212,7 @@
           <w:szCs w:val="22"/>
           <w:lang w:val="en-US"/>
         </w:rPr>
-        <w:t xml:space="preserve">Access Points: AVR-AP1 </w:t>
-      </w:r>
-      <w:proofErr w:type="gramStart"/>
-      <w:r>
-        <w:rPr>
-          <w:sz w:val="22"/>
-          <w:szCs w:val="22"/>
-          <w:lang w:val="en-US"/>
-        </w:rPr>
-        <w:t>a</w:t>
-      </w:r>
-      <w:proofErr w:type="gramEnd"/>
-      <w:r>
-        <w:rPr>
-          <w:sz w:val="22"/>
-          <w:szCs w:val="22"/>
-          <w:lang w:val="en-US"/>
-        </w:rPr>
-        <w:t xml:space="preserve"> AVR-AP4 — para a rede wireless;</w:t>
+        <w:t>Access Points: AVR-AP1 a AVR-AP4 — para a rede wireless;</w:t>
       </w:r>
     </w:p>
     <w:p>
@@ -13553,7 +13569,7 @@
           <v:rect id="rectole0000000002" o:spid="_x0000_i1025" style="width:499.2pt;height:216.6pt" o:ole="" o:preferrelative="t" stroked="f">
             <v:imagedata r:id="rId9" o:title=""/>
           </v:rect>
-          <o:OLEObject Type="Embed" ProgID="StaticMetafile" ShapeID="rectole0000000002" DrawAspect="Content" ObjectID="_1840903475" r:id="rId10"/>
+          <o:OLEObject Type="Embed" ProgID="StaticMetafile" ShapeID="rectole0000000002" DrawAspect="Content" ObjectID="_1840955690" r:id="rId10"/>
         </w:object>
       </w:r>
     </w:p>
@@ -13567,7 +13583,7 @@
           <v:rect id="rectole0000000003" o:spid="_x0000_i1026" style="width:502.8pt;height:295.8pt" o:ole="" o:preferrelative="t" stroked="f">
             <v:imagedata r:id="rId11" o:title=""/>
           </v:rect>
-          <o:OLEObject Type="Embed" ProgID="StaticMetafile" ShapeID="rectole0000000003" DrawAspect="Content" ObjectID="_1840903476" r:id="rId12"/>
+          <o:OLEObject Type="Embed" ProgID="StaticMetafile" ShapeID="rectole0000000003" DrawAspect="Content" ObjectID="_1840955691" r:id="rId12"/>
         </w:object>
       </w:r>
     </w:p>
@@ -13620,7 +13636,7 @@
           <v:rect id="rectole0000000004" o:spid="_x0000_i1027" style="width:468pt;height:276pt" o:ole="" o:preferrelative="t" stroked="f">
             <v:imagedata r:id="rId13" o:title=""/>
           </v:rect>
-          <o:OLEObject Type="Embed" ProgID="StaticMetafile" ShapeID="rectole0000000004" DrawAspect="Content" ObjectID="_1840903477" r:id="rId14"/>
+          <o:OLEObject Type="Embed" ProgID="StaticMetafile" ShapeID="rectole0000000004" DrawAspect="Content" ObjectID="_1840955692" r:id="rId14"/>
         </w:object>
       </w:r>
     </w:p>
@@ -13634,7 +13650,7 @@
           <v:rect id="rectole0000000005" o:spid="_x0000_i1028" style="width:468pt;height:339.6pt" o:ole="" o:preferrelative="t" stroked="f">
             <v:imagedata r:id="rId15" o:title=""/>
           </v:rect>
-          <o:OLEObject Type="Embed" ProgID="StaticMetafile" ShapeID="rectole0000000005" DrawAspect="Content" ObjectID="_1840903478" r:id="rId16"/>
+          <o:OLEObject Type="Embed" ProgID="StaticMetafile" ShapeID="rectole0000000005" DrawAspect="Content" ObjectID="_1840955693" r:id="rId16"/>
         </w:object>
       </w:r>
     </w:p>
@@ -13681,7 +13697,7 @@
           <v:rect id="rectole0000000006" o:spid="_x0000_i1029" style="width:468pt;height:177pt" o:ole="" o:preferrelative="t" stroked="f">
             <v:imagedata r:id="rId17" o:title=""/>
           </v:rect>
-          <o:OLEObject Type="Embed" ProgID="StaticMetafile" ShapeID="rectole0000000006" DrawAspect="Content" ObjectID="_1840903479" r:id="rId18"/>
+          <o:OLEObject Type="Embed" ProgID="StaticMetafile" ShapeID="rectole0000000006" DrawAspect="Content" ObjectID="_1840955694" r:id="rId18"/>
         </w:object>
       </w:r>
     </w:p>
@@ -13843,7 +13859,6 @@
         <w:t xml:space="preserve"> 0/0) subdividida em múltiplas </w:t>
       </w:r>
       <w:proofErr w:type="spellStart"/>
-      <w:proofErr w:type="gramStart"/>
       <w:r>
         <w:rPr>
           <w:color w:val="000000"/>
@@ -13853,7 +13868,6 @@
         <w:t>sub-interfaces</w:t>
       </w:r>
       <w:proofErr w:type="spellEnd"/>
-      <w:proofErr w:type="gramEnd"/>
       <w:r>
         <w:rPr>
           <w:color w:val="000000"/>
@@ -13882,7 +13896,6 @@
         <w:t xml:space="preserve">Cada </w:t>
       </w:r>
       <w:proofErr w:type="spellStart"/>
-      <w:proofErr w:type="gramStart"/>
       <w:r>
         <w:rPr>
           <w:color w:val="000000"/>
@@ -13892,7 +13905,6 @@
         <w:t>sub-interface</w:t>
       </w:r>
       <w:proofErr w:type="spellEnd"/>
-      <w:proofErr w:type="gramEnd"/>
       <w:r>
         <w:rPr>
           <w:color w:val="000000"/>
@@ -13924,7 +13936,6 @@
         <w:t xml:space="preserve">Encapsulamento dot1Q: Para associar a </w:t>
       </w:r>
       <w:proofErr w:type="spellStart"/>
-      <w:proofErr w:type="gramStart"/>
       <w:r>
         <w:rPr>
           <w:color w:val="000000"/>
@@ -13934,7 +13945,6 @@
         <w:t>sub-interface</w:t>
       </w:r>
       <w:proofErr w:type="spellEnd"/>
-      <w:proofErr w:type="gramEnd"/>
       <w:r>
         <w:rPr>
           <w:color w:val="000000"/>
@@ -14339,7 +14349,6 @@
         <w:t xml:space="preserve"> no </w:t>
       </w:r>
       <w:proofErr w:type="spellStart"/>
-      <w:proofErr w:type="gramStart"/>
       <w:r>
         <w:rPr>
           <w:color w:val="000000"/>
@@ -14355,16 +14364,7 @@
           <w:sz w:val="20"/>
           <w:szCs w:val="20"/>
         </w:rPr>
-        <w:t xml:space="preserve">  !</w:t>
-      </w:r>
-      <w:proofErr w:type="gramEnd"/>
-      <w:r>
-        <w:rPr>
-          <w:color w:val="000000"/>
-          <w:sz w:val="20"/>
-          <w:szCs w:val="20"/>
-        </w:rPr>
-        <w:t xml:space="preserve"> Ativa a interface </w:t>
+        <w:t xml:space="preserve">  ! Ativa a interface </w:t>
       </w:r>
       <w:proofErr w:type="spellStart"/>
       <w:r>
@@ -14444,9 +14444,9 @@
           <w:szCs w:val="20"/>
           <w:lang w:val="en-US"/>
         </w:rPr>
-        <w:t xml:space="preserve"> </w:t>
-      </w:r>
-      <w:proofErr w:type="gramStart"/>
+        <w:t xml:space="preserve"> description Gateway VLAN 70 - </w:t>
+      </w:r>
+      <w:proofErr w:type="spellStart"/>
       <w:r>
         <w:rPr>
           <w:color w:val="000000"/>
@@ -14454,19 +14454,21 @@
           <w:szCs w:val="20"/>
           <w:lang w:val="en-US"/>
         </w:rPr>
-        <w:t>description</w:t>
-      </w:r>
-      <w:proofErr w:type="gramEnd"/>
-      <w:r>
+        <w:t>Quiosque</w:t>
+      </w:r>
+      <w:proofErr w:type="spellEnd"/>
+    </w:p>
+    <w:p>
+      <w:pPr>
+        <w:spacing w:before="200" w:after="100"/>
+        <w:jc w:val="both"/>
         <w:rPr>
           <w:color w:val="000000"/>
           <w:sz w:val="20"/>
           <w:szCs w:val="20"/>
           <w:lang w:val="en-US"/>
         </w:rPr>
-        <w:t xml:space="preserve"> Gateway VLAN 70 - </w:t>
-      </w:r>
-      <w:proofErr w:type="spellStart"/>
+      </w:pPr>
       <w:r>
         <w:rPr>
           <w:color w:val="000000"/>
@@ -14474,9 +14476,8 @@
           <w:szCs w:val="20"/>
           <w:lang w:val="en-US"/>
         </w:rPr>
-        <w:t>Quiosque</w:t>
-      </w:r>
-      <w:proofErr w:type="spellEnd"/>
+        <w:t xml:space="preserve"> encapsulation dot1Q 70</w:t>
+      </w:r>
     </w:p>
     <w:p>
       <w:pPr>
@@ -14496,20 +14497,19 @@
           <w:szCs w:val="20"/>
           <w:lang w:val="en-US"/>
         </w:rPr>
-        <w:t xml:space="preserve"> encapsulation dot1Q 70</w:t>
-      </w:r>
-    </w:p>
-    <w:p>
-      <w:pPr>
-        <w:spacing w:before="200" w:after="100"/>
-        <w:jc w:val="both"/>
+        <w:t xml:space="preserve"> </w:t>
+      </w:r>
+      <w:proofErr w:type="spellStart"/>
+      <w:r>
         <w:rPr>
           <w:color w:val="000000"/>
           <w:sz w:val="20"/>
           <w:szCs w:val="20"/>
           <w:lang w:val="en-US"/>
         </w:rPr>
-      </w:pPr>
+        <w:t>ip</w:t>
+      </w:r>
+      <w:proofErr w:type="spellEnd"/>
       <w:r>
         <w:rPr>
           <w:color w:val="000000"/>
@@ -14517,19 +14517,20 @@
           <w:szCs w:val="20"/>
           <w:lang w:val="en-US"/>
         </w:rPr>
-        <w:t xml:space="preserve"> </w:t>
-      </w:r>
-      <w:proofErr w:type="spellStart"/>
-      <w:r>
+        <w:t xml:space="preserve"> address 10.99.9.1 255.255.255.192</w:t>
+      </w:r>
+    </w:p>
+    <w:p>
+      <w:pPr>
+        <w:spacing w:before="200" w:after="100"/>
+        <w:jc w:val="both"/>
         <w:rPr>
           <w:color w:val="000000"/>
           <w:sz w:val="20"/>
           <w:szCs w:val="20"/>
           <w:lang w:val="en-US"/>
         </w:rPr>
-        <w:t>ip</w:t>
-      </w:r>
-      <w:proofErr w:type="spellEnd"/>
+      </w:pPr>
       <w:r>
         <w:rPr>
           <w:color w:val="000000"/>
@@ -14537,20 +14538,19 @@
           <w:szCs w:val="20"/>
           <w:lang w:val="en-US"/>
         </w:rPr>
-        <w:t xml:space="preserve"> address 10.99.9.1 255.255.255.192</w:t>
-      </w:r>
-    </w:p>
-    <w:p>
-      <w:pPr>
-        <w:spacing w:before="200" w:after="100"/>
-        <w:jc w:val="both"/>
+        <w:t xml:space="preserve">interface </w:t>
+      </w:r>
+      <w:proofErr w:type="spellStart"/>
+      <w:r>
         <w:rPr>
           <w:color w:val="000000"/>
           <w:sz w:val="20"/>
           <w:szCs w:val="20"/>
           <w:lang w:val="en-US"/>
         </w:rPr>
-      </w:pPr>
+        <w:t>GigabitEthernet</w:t>
+      </w:r>
+      <w:proofErr w:type="spellEnd"/>
       <w:r>
         <w:rPr>
           <w:color w:val="000000"/>
@@ -14558,19 +14558,20 @@
           <w:szCs w:val="20"/>
           <w:lang w:val="en-US"/>
         </w:rPr>
-        <w:t xml:space="preserve">interface </w:t>
-      </w:r>
-      <w:proofErr w:type="spellStart"/>
-      <w:r>
+        <w:t xml:space="preserve"> 0/0.160</w:t>
+      </w:r>
+    </w:p>
+    <w:p>
+      <w:pPr>
+        <w:spacing w:before="200" w:after="100"/>
+        <w:jc w:val="both"/>
         <w:rPr>
           <w:color w:val="000000"/>
           <w:sz w:val="20"/>
           <w:szCs w:val="20"/>
           <w:lang w:val="en-US"/>
         </w:rPr>
-        <w:t>GigabitEthernet</w:t>
-      </w:r>
-      <w:proofErr w:type="spellEnd"/>
+      </w:pPr>
       <w:r>
         <w:rPr>
           <w:color w:val="000000"/>
@@ -14578,48 +14579,7 @@
           <w:szCs w:val="20"/>
           <w:lang w:val="en-US"/>
         </w:rPr>
-        <w:t xml:space="preserve"> 0/0.160</w:t>
-      </w:r>
-    </w:p>
-    <w:p>
-      <w:pPr>
-        <w:spacing w:before="200" w:after="100"/>
-        <w:jc w:val="both"/>
-        <w:rPr>
-          <w:color w:val="000000"/>
-          <w:sz w:val="20"/>
-          <w:szCs w:val="20"/>
-          <w:lang w:val="en-US"/>
-        </w:rPr>
-      </w:pPr>
-      <w:r>
-        <w:rPr>
-          <w:color w:val="000000"/>
-          <w:sz w:val="20"/>
-          <w:szCs w:val="20"/>
-          <w:lang w:val="en-US"/>
-        </w:rPr>
-        <w:t xml:space="preserve"> </w:t>
-      </w:r>
-      <w:proofErr w:type="gramStart"/>
-      <w:r>
-        <w:rPr>
-          <w:color w:val="000000"/>
-          <w:sz w:val="20"/>
-          <w:szCs w:val="20"/>
-          <w:lang w:val="en-US"/>
-        </w:rPr>
-        <w:t>description</w:t>
-      </w:r>
-      <w:proofErr w:type="gramEnd"/>
-      <w:r>
-        <w:rPr>
-          <w:color w:val="000000"/>
-          <w:sz w:val="20"/>
-          <w:szCs w:val="20"/>
-          <w:lang w:val="en-US"/>
-        </w:rPr>
-        <w:t xml:space="preserve"> Gateway VLAN 160 - Servers</w:t>
+        <w:t xml:space="preserve"> description Gateway VLAN 160 - Servers</w:t>
       </w:r>
     </w:p>
     <w:p>
@@ -14866,10 +14826,58 @@
           <w:szCs w:val="20"/>
           <w:lang w:val="en-US"/>
         </w:rPr>
-        <w:t xml:space="preserve"> </w:t>
-      </w:r>
-      <w:proofErr w:type="gramStart"/>
-      <w:r>
+        <w:t xml:space="preserve"> no shutdown</w:t>
+      </w:r>
+    </w:p>
+    <w:p>
+      <w:pPr>
+        <w:spacing w:before="200" w:after="100"/>
+        <w:jc w:val="both"/>
+        <w:rPr>
+          <w:b/>
+          <w:color w:val="2E75B6"/>
+          <w:sz w:val="22"/>
+          <w:szCs w:val="20"/>
+          <w:lang w:val="en-US"/>
+        </w:rPr>
+      </w:pPr>
+      <w:r>
+        <w:rPr>
+          <w:b/>
+          <w:color w:val="2E75B6"/>
+          <w:sz w:val="22"/>
+          <w:szCs w:val="20"/>
+          <w:lang w:val="en-US"/>
+        </w:rPr>
+        <w:t>Interfaces LAN (</w:t>
+      </w:r>
+      <w:proofErr w:type="spellStart"/>
+      <w:r>
+        <w:rPr>
+          <w:b/>
+          <w:color w:val="2E75B6"/>
+          <w:sz w:val="22"/>
+          <w:szCs w:val="20"/>
+          <w:lang w:val="en-US"/>
+        </w:rPr>
+        <w:t>Exemplo</w:t>
+      </w:r>
+      <w:proofErr w:type="spellEnd"/>
+      <w:r>
+        <w:rPr>
+          <w:b/>
+          <w:color w:val="2E75B6"/>
+          <w:sz w:val="22"/>
+          <w:szCs w:val="20"/>
+          <w:lang w:val="en-US"/>
+        </w:rPr>
+        <w:t xml:space="preserve"> para VLAN 30 - Guest e VLAN 500 - Management):</w:t>
+      </w:r>
+    </w:p>
+    <w:p>
+      <w:pPr>
+        <w:spacing w:before="200" w:after="100"/>
+        <w:jc w:val="both"/>
         <w:rPr>
           <w:i/>
           <w:color w:val="000000"/>
@@ -14877,9 +14885,7 @@
           <w:szCs w:val="20"/>
           <w:lang w:val="en-US"/>
         </w:rPr>
-        <w:t>no</w:t>
-      </w:r>
-      <w:proofErr w:type="gramEnd"/>
+      </w:pPr>
       <w:r>
         <w:rPr>
           <w:i/>
@@ -14888,58 +14894,10 @@
           <w:szCs w:val="20"/>
           <w:lang w:val="en-US"/>
         </w:rPr>
-        <w:t xml:space="preserve"> shutdown</w:t>
-      </w:r>
-    </w:p>
-    <w:p>
-      <w:pPr>
-        <w:spacing w:before="200" w:after="100"/>
-        <w:jc w:val="both"/>
-        <w:rPr>
-          <w:b/>
-          <w:color w:val="2E75B6"/>
-          <w:sz w:val="22"/>
-          <w:szCs w:val="20"/>
-          <w:lang w:val="en-US"/>
-        </w:rPr>
-      </w:pPr>
-      <w:r>
-        <w:rPr>
-          <w:b/>
-          <w:color w:val="2E75B6"/>
-          <w:sz w:val="22"/>
-          <w:szCs w:val="20"/>
-          <w:lang w:val="en-US"/>
-        </w:rPr>
-        <w:t>Interfaces LAN (</w:t>
+        <w:t xml:space="preserve">interface </w:t>
       </w:r>
       <w:proofErr w:type="spellStart"/>
       <w:r>
-        <w:rPr>
-          <w:b/>
-          <w:color w:val="2E75B6"/>
-          <w:sz w:val="22"/>
-          <w:szCs w:val="20"/>
-          <w:lang w:val="en-US"/>
-        </w:rPr>
-        <w:t>Exemplo</w:t>
-      </w:r>
-      <w:proofErr w:type="spellEnd"/>
-      <w:r>
-        <w:rPr>
-          <w:b/>
-          <w:color w:val="2E75B6"/>
-          <w:sz w:val="22"/>
-          <w:szCs w:val="20"/>
-          <w:lang w:val="en-US"/>
-        </w:rPr>
-        <w:t xml:space="preserve"> para VLAN 30 - Guest e VLAN 500 - Management):</w:t>
-      </w:r>
-    </w:p>
-    <w:p>
-      <w:pPr>
-        <w:spacing w:before="200" w:after="100"/>
-        <w:jc w:val="both"/>
         <w:rPr>
           <w:i/>
           <w:color w:val="000000"/>
@@ -14947,7 +14905,9 @@
           <w:szCs w:val="20"/>
           <w:lang w:val="en-US"/>
         </w:rPr>
-      </w:pPr>
+        <w:t>GigabitEthernet</w:t>
+      </w:r>
+      <w:proofErr w:type="spellEnd"/>
       <w:r>
         <w:rPr>
           <w:i/>
@@ -14956,10 +14916,13 @@
           <w:szCs w:val="20"/>
           <w:lang w:val="en-US"/>
         </w:rPr>
-        <w:t xml:space="preserve">interface </w:t>
-      </w:r>
-      <w:proofErr w:type="spellStart"/>
-      <w:r>
+        <w:t xml:space="preserve"> 0/0</w:t>
+      </w:r>
+    </w:p>
+    <w:p>
+      <w:pPr>
+        <w:spacing w:before="200" w:after="100"/>
+        <w:jc w:val="both"/>
         <w:rPr>
           <w:i/>
           <w:color w:val="000000"/>
@@ -14967,9 +14930,7 @@
           <w:szCs w:val="20"/>
           <w:lang w:val="en-US"/>
         </w:rPr>
-        <w:t>GigabitEthernet</w:t>
-      </w:r>
-      <w:proofErr w:type="spellEnd"/>
+      </w:pPr>
       <w:r>
         <w:rPr>
           <w:i/>
@@ -14978,7 +14939,7 @@
           <w:szCs w:val="20"/>
           <w:lang w:val="en-US"/>
         </w:rPr>
-        <w:t xml:space="preserve"> 0/0</w:t>
+        <w:t xml:space="preserve"> no shutdown</w:t>
       </w:r>
     </w:p>
     <w:p>
@@ -15001,9 +14962,9 @@
           <w:szCs w:val="20"/>
           <w:lang w:val="en-US"/>
         </w:rPr>
-        <w:t xml:space="preserve"> </w:t>
-      </w:r>
-      <w:proofErr w:type="gramStart"/>
+        <w:t xml:space="preserve">interface </w:t>
+      </w:r>
+      <w:proofErr w:type="spellStart"/>
       <w:r>
         <w:rPr>
           <w:i/>
@@ -15012,9 +14973,9 @@
           <w:szCs w:val="20"/>
           <w:lang w:val="en-US"/>
         </w:rPr>
-        <w:t>no</w:t>
-      </w:r>
-      <w:proofErr w:type="gramEnd"/>
+        <w:t>GigabitEthernet</w:t>
+      </w:r>
+      <w:proofErr w:type="spellEnd"/>
       <w:r>
         <w:rPr>
           <w:i/>
@@ -15023,7 +14984,7 @@
           <w:szCs w:val="20"/>
           <w:lang w:val="en-US"/>
         </w:rPr>
-        <w:t xml:space="preserve"> shutdown</w:t>
+        <w:t xml:space="preserve"> 0/0.30</w:t>
       </w:r>
     </w:p>
     <w:p>
@@ -15046,10 +15007,13 @@
           <w:szCs w:val="20"/>
           <w:lang w:val="en-US"/>
         </w:rPr>
-        <w:t xml:space="preserve">interface </w:t>
-      </w:r>
-      <w:proofErr w:type="spellStart"/>
-      <w:r>
+        <w:t xml:space="preserve"> description Gateway VLAN 30 - Guest</w:t>
+      </w:r>
+    </w:p>
+    <w:p>
+      <w:pPr>
+        <w:spacing w:before="200" w:after="100"/>
+        <w:jc w:val="both"/>
         <w:rPr>
           <w:i/>
           <w:color w:val="000000"/>
@@ -15057,9 +15021,7 @@
           <w:szCs w:val="20"/>
           <w:lang w:val="en-US"/>
         </w:rPr>
-        <w:t>GigabitEthernet</w:t>
-      </w:r>
-      <w:proofErr w:type="spellEnd"/>
+      </w:pPr>
       <w:r>
         <w:rPr>
           <w:i/>
@@ -15068,7 +15030,7 @@
           <w:szCs w:val="20"/>
           <w:lang w:val="en-US"/>
         </w:rPr>
-        <w:t xml:space="preserve"> 0/0.30</w:t>
+        <w:t xml:space="preserve"> encapsulation dot1Q 30</w:t>
       </w:r>
     </w:p>
     <w:p>
@@ -15091,13 +15053,10 @@
           <w:szCs w:val="20"/>
           <w:lang w:val="en-US"/>
         </w:rPr>
-        <w:t xml:space="preserve"> description Gateway VLAN 30 - Guest</w:t>
-      </w:r>
-    </w:p>
-    <w:p>
-      <w:pPr>
-        <w:spacing w:before="200" w:after="100"/>
-        <w:jc w:val="both"/>
+        <w:t xml:space="preserve"> </w:t>
+      </w:r>
+      <w:proofErr w:type="spellStart"/>
+      <w:r>
         <w:rPr>
           <w:i/>
           <w:color w:val="000000"/>
@@ -15105,7 +15064,9 @@
           <w:szCs w:val="20"/>
           <w:lang w:val="en-US"/>
         </w:rPr>
-      </w:pPr>
+        <w:t>ip</w:t>
+      </w:r>
+      <w:proofErr w:type="spellEnd"/>
       <w:r>
         <w:rPr>
           <w:i/>
@@ -15114,7 +15075,7 @@
           <w:szCs w:val="20"/>
           <w:lang w:val="en-US"/>
         </w:rPr>
-        <w:t xml:space="preserve"> encapsulation dot1Q 30</w:t>
+        <w:t xml:space="preserve"> address 10.30.9.1 255.255.255.192</w:t>
       </w:r>
     </w:p>
     <w:p>
@@ -15137,7 +15098,7 @@
           <w:szCs w:val="20"/>
           <w:lang w:val="en-US"/>
         </w:rPr>
-        <w:t xml:space="preserve"> </w:t>
+        <w:t xml:space="preserve">interface </w:t>
       </w:r>
       <w:proofErr w:type="spellStart"/>
       <w:r>
@@ -15148,7 +15109,7 @@
           <w:szCs w:val="20"/>
           <w:lang w:val="en-US"/>
         </w:rPr>
-        <w:t>ip</w:t>
+        <w:t>GigabitEthernet</w:t>
       </w:r>
       <w:proofErr w:type="spellEnd"/>
       <w:r>
@@ -15159,7 +15120,7 @@
           <w:szCs w:val="20"/>
           <w:lang w:val="en-US"/>
         </w:rPr>
-        <w:t xml:space="preserve"> address 10.30.9.1 255.255.255.192</w:t>
+        <w:t xml:space="preserve"> 0/0.500</w:t>
       </w:r>
     </w:p>
     <w:p>
@@ -15182,9 +15143,20 @@
           <w:szCs w:val="20"/>
           <w:lang w:val="en-US"/>
         </w:rPr>
-        <w:t xml:space="preserve">interface </w:t>
-      </w:r>
-      <w:proofErr w:type="spellStart"/>
+        <w:t xml:space="preserve"> description Gateway VLAN 500 - Management</w:t>
+      </w:r>
+    </w:p>
+    <w:p>
+      <w:pPr>
+        <w:spacing w:before="200" w:after="100"/>
+        <w:jc w:val="both"/>
+        <w:rPr>
+          <w:i/>
+          <w:color w:val="000000"/>
+          <w:sz w:val="20"/>
+          <w:szCs w:val="20"/>
+        </w:rPr>
+      </w:pPr>
       <w:r>
         <w:rPr>
           <w:i/>
@@ -15193,65 +15165,60 @@
           <w:szCs w:val="20"/>
           <w:lang w:val="en-US"/>
         </w:rPr>
-        <w:t>GigabitEthernet</w:t>
-      </w:r>
-      <w:proofErr w:type="spellEnd"/>
+        <w:t xml:space="preserve"> </w:t>
+      </w:r>
+      <w:proofErr w:type="spellStart"/>
       <w:r>
         <w:rPr>
           <w:i/>
           <w:color w:val="000000"/>
           <w:sz w:val="20"/>
           <w:szCs w:val="20"/>
-          <w:lang w:val="en-US"/>
-        </w:rPr>
-        <w:t xml:space="preserve"> 0/0.500</w:t>
-      </w:r>
-    </w:p>
-    <w:p>
-      <w:pPr>
-        <w:spacing w:before="200" w:after="100"/>
-        <w:jc w:val="both"/>
+        </w:rPr>
+        <w:t>encapsulation</w:t>
+      </w:r>
+      <w:proofErr w:type="spellEnd"/>
+      <w:r>
         <w:rPr>
           <w:i/>
           <w:color w:val="000000"/>
           <w:sz w:val="20"/>
           <w:szCs w:val="20"/>
-          <w:lang w:val="en-US"/>
-        </w:rPr>
-      </w:pPr>
-      <w:r>
+        </w:rPr>
+        <w:t xml:space="preserve"> dot1Q 500</w:t>
+      </w:r>
+    </w:p>
+    <w:p>
+      <w:pPr>
+        <w:spacing w:before="200" w:after="100"/>
+        <w:jc w:val="both"/>
         <w:rPr>
           <w:i/>
           <w:color w:val="000000"/>
           <w:sz w:val="20"/>
           <w:szCs w:val="20"/>
-          <w:lang w:val="en-US"/>
-        </w:rPr>
-        <w:t xml:space="preserve"> description Gateway VLAN 500 - Management</w:t>
-      </w:r>
-    </w:p>
-    <w:p>
-      <w:pPr>
-        <w:spacing w:before="200" w:after="100"/>
-        <w:jc w:val="both"/>
+        </w:rPr>
+      </w:pPr>
+      <w:r>
         <w:rPr>
           <w:i/>
           <w:color w:val="000000"/>
           <w:sz w:val="20"/>
           <w:szCs w:val="20"/>
         </w:rPr>
-      </w:pPr>
+        <w:t xml:space="preserve"> </w:t>
+      </w:r>
+      <w:proofErr w:type="spellStart"/>
       <w:r>
         <w:rPr>
           <w:i/>
           <w:color w:val="000000"/>
           <w:sz w:val="20"/>
           <w:szCs w:val="20"/>
-          <w:lang w:val="en-US"/>
-        </w:rPr>
-        <w:t xml:space="preserve"> </w:t>
-      </w:r>
-      <w:proofErr w:type="spellStart"/>
+        </w:rPr>
+        <w:t>ip</w:t>
+      </w:r>
+      <w:proofErr w:type="spellEnd"/>
       <w:r>
         <w:rPr>
           <w:i/>
@@ -15259,9 +15226,9 @@
           <w:sz w:val="20"/>
           <w:szCs w:val="20"/>
         </w:rPr>
-        <w:t>encapsulation</w:t>
-      </w:r>
-      <w:proofErr w:type="spellEnd"/>
+        <w:t xml:space="preserve"> </w:t>
+      </w:r>
+      <w:proofErr w:type="spellStart"/>
       <w:r>
         <w:rPr>
           <w:i/>
@@ -15269,67 +15236,16 @@
           <w:sz w:val="20"/>
           <w:szCs w:val="20"/>
         </w:rPr>
-        <w:t xml:space="preserve"> dot1Q 500</w:t>
-      </w:r>
-    </w:p>
-    <w:p>
-      <w:pPr>
-        <w:spacing w:before="200" w:after="100"/>
-        <w:jc w:val="both"/>
+        <w:t>address</w:t>
+      </w:r>
+      <w:proofErr w:type="spellEnd"/>
+      <w:r>
         <w:rPr>
           <w:i/>
           <w:color w:val="000000"/>
           <w:sz w:val="20"/>
           <w:szCs w:val="20"/>
         </w:rPr>
-      </w:pPr>
-      <w:r>
-        <w:rPr>
-          <w:i/>
-          <w:color w:val="000000"/>
-          <w:sz w:val="20"/>
-          <w:szCs w:val="20"/>
-        </w:rPr>
-        <w:t xml:space="preserve"> </w:t>
-      </w:r>
-      <w:proofErr w:type="spellStart"/>
-      <w:r>
-        <w:rPr>
-          <w:i/>
-          <w:color w:val="000000"/>
-          <w:sz w:val="20"/>
-          <w:szCs w:val="20"/>
-        </w:rPr>
-        <w:t>ip</w:t>
-      </w:r>
-      <w:proofErr w:type="spellEnd"/>
-      <w:r>
-        <w:rPr>
-          <w:i/>
-          <w:color w:val="000000"/>
-          <w:sz w:val="20"/>
-          <w:szCs w:val="20"/>
-        </w:rPr>
-        <w:t xml:space="preserve"> </w:t>
-      </w:r>
-      <w:proofErr w:type="spellStart"/>
-      <w:r>
-        <w:rPr>
-          <w:i/>
-          <w:color w:val="000000"/>
-          <w:sz w:val="20"/>
-          <w:szCs w:val="20"/>
-        </w:rPr>
-        <w:t>address</w:t>
-      </w:r>
-      <w:proofErr w:type="spellEnd"/>
-      <w:r>
-        <w:rPr>
-          <w:i/>
-          <w:color w:val="000000"/>
-          <w:sz w:val="20"/>
-          <w:szCs w:val="20"/>
-        </w:rPr>
         <w:t xml:space="preserve"> 10.30.9.65 255.255.255.192</w:t>
       </w:r>
     </w:p>
@@ -15364,7 +15280,6 @@
         <w:t xml:space="preserve">A utilização de </w:t>
       </w:r>
       <w:proofErr w:type="spellStart"/>
-      <w:proofErr w:type="gramStart"/>
       <w:r>
         <w:rPr>
           <w:color w:val="000000"/>
@@ -15374,7 +15289,6 @@
         <w:t>sub-interfaces</w:t>
       </w:r>
       <w:proofErr w:type="spellEnd"/>
-      <w:proofErr w:type="gramEnd"/>
       <w:r>
         <w:rPr>
           <w:color w:val="000000"/>
@@ -16229,7 +16143,7 @@
         </w:rPr>
         <w:lastRenderedPageBreak/>
         <w:drawing>
-          <wp:inline distT="0" distB="0" distL="0" distR="0" wp14:anchorId="3A322386" wp14:editId="6FD434BC">
+          <wp:inline distT="0" distB="0" distL="0" distR="0" wp14:anchorId="3A322386" wp14:editId="2263FE45">
             <wp:extent cx="6195060" cy="1385570"/>
             <wp:effectExtent l="0" t="0" r="0" b="5080"/>
             <wp:docPr id="2030355210" name="Imagem 3"/>
@@ -16474,7 +16388,7 @@
           <w:sz w:val="22"/>
         </w:rPr>
         <w:drawing>
-          <wp:inline distT="0" distB="0" distL="0" distR="0" wp14:anchorId="56F50145" wp14:editId="0F55F63D">
+          <wp:inline distT="0" distB="0" distL="0" distR="0" wp14:anchorId="56F50145" wp14:editId="7DE702D1">
             <wp:extent cx="6316980" cy="1621155"/>
             <wp:effectExtent l="0" t="0" r="7620" b="0"/>
             <wp:docPr id="1189285225" name="Imagem 4"/>
@@ -18439,81 +18353,6 @@
     </w:p>
     <w:p>
       <w:pPr>
-        <w:spacing w:before="200" w:after="100"/>
-        <w:jc w:val="both"/>
-        <w:rPr>
-          <w:bCs/>
-          <w:sz w:val="22"/>
-          <w:szCs w:val="22"/>
-        </w:rPr>
-      </w:pPr>
-    </w:p>
-    <w:p>
-      <w:pPr>
-        <w:pStyle w:val="Ttulo2"/>
-        <w:jc w:val="both"/>
-      </w:pPr>
-      <w:r>
-        <w:t>5.9. Testes e Resultados</w:t>
-      </w:r>
-    </w:p>
-    <w:p>
-      <w:pPr>
-        <w:spacing w:before="80" w:after="80"/>
-        <w:jc w:val="both"/>
-      </w:pPr>
-      <w:r>
-        <w:rPr>
-          <w:i/>
-          <w:color w:val="AAAAAA"/>
-          <w:sz w:val="22"/>
-          <w:szCs w:val="22"/>
-        </w:rPr>
-        <w:t xml:space="preserve">[A preencher — </w:t>
-      </w:r>
-      <w:proofErr w:type="spellStart"/>
-      <w:r>
-        <w:rPr>
-          <w:i/>
-          <w:color w:val="AAAAAA"/>
-          <w:sz w:val="22"/>
-          <w:szCs w:val="22"/>
-        </w:rPr>
-        <w:t>ping</w:t>
-      </w:r>
-      <w:proofErr w:type="spellEnd"/>
-      <w:r>
-        <w:rPr>
-          <w:i/>
-          <w:color w:val="AAAAAA"/>
-          <w:sz w:val="22"/>
-          <w:szCs w:val="22"/>
-        </w:rPr>
-        <w:t xml:space="preserve"> entre </w:t>
-      </w:r>
-      <w:proofErr w:type="spellStart"/>
-      <w:r>
-        <w:rPr>
-          <w:i/>
-          <w:color w:val="AAAAAA"/>
-          <w:sz w:val="22"/>
-          <w:szCs w:val="22"/>
-        </w:rPr>
-        <w:t>hosts</w:t>
-      </w:r>
-      <w:proofErr w:type="spellEnd"/>
-      <w:r>
-        <w:rPr>
-          <w:i/>
-          <w:color w:val="AAAAAA"/>
-          <w:sz w:val="22"/>
-          <w:szCs w:val="22"/>
-        </w:rPr>
-        <w:t>, acesso ao website, testes de conectividade entre Aveiro e Covilhã, NAT, DHCP]</w:t>
-      </w:r>
-    </w:p>
-    <w:p>
-      <w:pPr>
         <w:pStyle w:val="Ttulo1"/>
         <w:jc w:val="both"/>
       </w:pPr>
@@ -18622,7 +18461,19 @@
         <w:rPr>
           <w:color w:val="000000"/>
         </w:rPr>
-        <w:t>A primeira fase do projeto prático foi concluída com sucesso. Conseguimos planear e dimensionar o endereçamento IP para as duas localizações — Aveiro e Covilhã — utilizando corretamente a técnica VLSM, respeitando os requisitos de hosts definidos no enunciado e evitando o desperdício desnecessário de endereços.</w:t>
+        <w:t>A primeira fase do projeto prático foi concluída com sucesso. Conseguimos planear e dimensionar o endereçamento IP para as duas localizações Aveiro e Covilhã</w:t>
+      </w:r>
+      <w:r>
+        <w:rPr>
+          <w:color w:val="000000"/>
+        </w:rPr>
+        <w:t xml:space="preserve"> </w:t>
+      </w:r>
+      <w:r>
+        <w:rPr>
+          <w:color w:val="000000"/>
+        </w:rPr>
+        <w:t>utilizando corretamente a técnica VLSM, respeitando os requisitos de hosts definidos no enunciado e evitando o desperdício desnecessário de endereços.</w:t>
       </w:r>
     </w:p>
     <w:p>
@@ -18841,7 +18692,6 @@
       <w:bookmarkStart w:id="17" w:name="_7._Anexos"/>
       <w:bookmarkEnd w:id="17"/>
       <w:r>
-        <w:lastRenderedPageBreak/>
         <w:t>7. Anexos</w:t>
       </w:r>
     </w:p>
@@ -18865,6 +18715,7 @@
         <w:rPr>
           <w:color w:val="000000"/>
         </w:rPr>
+        <w:lastRenderedPageBreak/>
         <w:br/>
       </w:r>
     </w:p>

</xml_diff>